<commit_message>
rebuild 质量调研分析表 matching actual template format
</commit_message>
<xml_diff>
--- a/质量调研分析表_聂文怡_填写版.docx
+++ b/质量调研分析表_聂文怡_填写版.docx
@@ -4,7 +4,7 @@
   <w:body>
     <w:p>
       <w:pPr>
-        <w:spacing w:after="40"/>
+        <w:spacing w:before="0" w:after="40"/>
         <w:jc w:val="center"/>
       </w:pPr>
       <w:r>
@@ -16,6 +16,34 @@
         <w:t>上南实验小学  2025学年第二学期  语文  学科调研质量分析</w:t>
       </w:r>
     </w:p>
+    <w:p>
+      <w:pPr>
+        <w:spacing w:before="0" w:after="120"/>
+        <w:jc w:val="left"/>
+      </w:pPr>
+      <w:r>
+        <w:rPr>
+          <w:rFonts w:ascii="宋体" w:hAnsi="宋体" w:eastAsia="宋体"/>
+          <w:b w:val="0"/>
+          <w:sz w:val="20"/>
+        </w:rPr>
+        <w:t>调研日期：2026年6月23日          年级：五年级          执教人：聂文怡</w:t>
+      </w:r>
+    </w:p>
+    <w:p>
+      <w:pPr>
+        <w:spacing w:before="0" w:after="60"/>
+        <w:jc w:val="left"/>
+      </w:pPr>
+      <w:r>
+        <w:rPr>
+          <w:rFonts w:ascii="宋体" w:hAnsi="宋体" w:eastAsia="宋体"/>
+          <w:b/>
+          <w:sz w:val="22"/>
+        </w:rPr>
+        <w:t>一．基本情况</w:t>
+      </w:r>
+    </w:p>
     <w:tbl>
       <w:tblPr>
         <w:tblStyle w:val="TableGrid"/>
@@ -23,23 +51,24 @@
         <w:tblLook w:firstColumn="1" w:firstRow="1" w:lastColumn="0" w:lastRow="0" w:noHBand="0" w:noVBand="1" w:val="04A0"/>
       </w:tblPr>
       <w:tblGrid>
-        <w:gridCol w:w="1376"/>
-        <w:gridCol w:w="1376"/>
-        <w:gridCol w:w="1376"/>
-        <w:gridCol w:w="1376"/>
-        <w:gridCol w:w="1376"/>
-        <w:gridCol w:w="1376"/>
-        <w:gridCol w:w="1376"/>
-        <w:gridCol w:w="1376"/>
-        <w:gridCol w:w="1376"/>
-        <w:gridCol w:w="1376"/>
-        <w:gridCol w:w="1376"/>
+        <w:gridCol w:w="907"/>
+        <w:gridCol w:w="907"/>
+        <w:gridCol w:w="907"/>
+        <w:gridCol w:w="907"/>
+        <w:gridCol w:w="907"/>
+        <w:gridCol w:w="907"/>
+        <w:gridCol w:w="907"/>
+        <w:gridCol w:w="907"/>
+        <w:gridCol w:w="907"/>
+        <w:gridCol w:w="907"/>
       </w:tblGrid>
       <w:tr>
+        <w:trPr>
+          <w:trHeight w:val="680"/>
+        </w:trPr>
         <w:tc>
           <w:tcPr>
-            <w:tcW w:type="dxa" w:w="907"/>
-            <w:gridSpan w:val="2"/>
+            <w:tcW w:type="dxa" w:w="850"/>
             <w:shd w:val="clear" w:color="auto" w:fill="D9D9D9"/>
           </w:tcPr>
           <w:p>
@@ -51,38 +80,16 @@
               <w:rPr>
                 <w:rFonts w:ascii="宋体" w:hAnsi="宋体" w:eastAsia="宋体"/>
                 <w:b/>
-                <w:sz w:val="18"/>
+                <w:sz w:val="20"/>
               </w:rPr>
-              <w:t>一、基本情况</w:t>
+              <w:t>班级</w:t>
             </w:r>
           </w:p>
         </w:tc>
         <w:tc>
           <w:tcPr>
-            <w:tcW w:type="dxa" w:w="1020"/>
-            <w:gridSpan w:val="9"/>
-          </w:tcPr>
-          <w:p>
-            <w:pPr>
-              <w:jc w:val="left"/>
-            </w:pPr>
-            <w:r/>
-            <w:r>
-              <w:rPr>
-                <w:rFonts w:ascii="宋体" w:hAnsi="宋体" w:eastAsia="宋体"/>
-                <w:b w:val="0"/>
-                <w:sz w:val="18"/>
-              </w:rPr>
-              <w:t>调研日期：2026年6月23日          年级：五年级          执教人：聂文怡</w:t>
-            </w:r>
-          </w:p>
-        </w:tc>
-      </w:tr>
-      <w:tr>
-        <w:tc>
-          <w:tcPr>
-            <w:tcW w:type="dxa" w:w="567"/>
-            <w:shd w:val="clear" w:color="auto" w:fill="EBEBEB"/>
+            <w:tcW w:type="dxa" w:w="850"/>
+            <w:shd w:val="clear" w:color="auto" w:fill="D9D9D9"/>
           </w:tcPr>
           <w:p>
             <w:pPr>
@@ -93,15 +100,18 @@
               <w:rPr>
                 <w:rFonts w:ascii="宋体" w:hAnsi="宋体" w:eastAsia="宋体"/>
                 <w:b/>
-                <w:sz w:val="18"/>
+                <w:sz w:val="20"/>
               </w:rPr>
+              <w:t>应考</w:t>
+              <w:br/>
+              <w:t>人数</w:t>
             </w:r>
           </w:p>
         </w:tc>
         <w:tc>
           <w:tcPr>
-            <w:tcW w:type="dxa" w:w="907"/>
-            <w:shd w:val="clear" w:color="auto" w:fill="EBEBEB"/>
+            <w:tcW w:type="dxa" w:w="850"/>
+            <w:shd w:val="clear" w:color="auto" w:fill="D9D9D9"/>
           </w:tcPr>
           <w:p>
             <w:pPr>
@@ -112,16 +122,18 @@
               <w:rPr>
                 <w:rFonts w:ascii="宋体" w:hAnsi="宋体" w:eastAsia="宋体"/>
                 <w:b/>
-                <w:sz w:val="18"/>
+                <w:sz w:val="20"/>
               </w:rPr>
-              <w:t>班级</w:t>
+              <w:t>参考</w:t>
+              <w:br/>
+              <w:t>人数</w:t>
             </w:r>
           </w:p>
         </w:tc>
         <w:tc>
           <w:tcPr>
-            <w:tcW w:type="dxa" w:w="1020"/>
-            <w:shd w:val="clear" w:color="auto" w:fill="EBEBEB"/>
+            <w:tcW w:type="dxa" w:w="850"/>
+            <w:shd w:val="clear" w:color="auto" w:fill="D9D9D9"/>
           </w:tcPr>
           <w:p>
             <w:pPr>
@@ -132,16 +144,18 @@
               <w:rPr>
                 <w:rFonts w:ascii="宋体" w:hAnsi="宋体" w:eastAsia="宋体"/>
                 <w:b/>
-                <w:sz w:val="18"/>
+                <w:sz w:val="20"/>
               </w:rPr>
-              <w:t>应考人数</w:t>
+              <w:t>优秀</w:t>
+              <w:br/>
+              <w:t>人数</w:t>
             </w:r>
           </w:p>
         </w:tc>
         <w:tc>
           <w:tcPr>
-            <w:tcW w:type="dxa" w:w="1020"/>
-            <w:shd w:val="clear" w:color="auto" w:fill="EBEBEB"/>
+            <w:tcW w:type="dxa" w:w="680"/>
+            <w:shd w:val="clear" w:color="auto" w:fill="D9D9D9"/>
           </w:tcPr>
           <w:p>
             <w:pPr>
@@ -152,16 +166,16 @@
               <w:rPr>
                 <w:rFonts w:ascii="宋体" w:hAnsi="宋体" w:eastAsia="宋体"/>
                 <w:b/>
-                <w:sz w:val="18"/>
+                <w:sz w:val="20"/>
               </w:rPr>
-              <w:t>参考人数</w:t>
+              <w:t>比例</w:t>
             </w:r>
           </w:p>
         </w:tc>
         <w:tc>
           <w:tcPr>
-            <w:tcW w:type="dxa" w:w="1134"/>
-            <w:shd w:val="clear" w:color="auto" w:fill="EBEBEB"/>
+            <w:tcW w:type="dxa" w:w="850"/>
+            <w:shd w:val="clear" w:color="auto" w:fill="D9D9D9"/>
           </w:tcPr>
           <w:p>
             <w:pPr>
@@ -172,16 +186,18 @@
               <w:rPr>
                 <w:rFonts w:ascii="宋体" w:hAnsi="宋体" w:eastAsia="宋体"/>
                 <w:b/>
-                <w:sz w:val="18"/>
+                <w:sz w:val="20"/>
               </w:rPr>
-              <w:t>优秀人数</w:t>
+              <w:t>良好</w:t>
+              <w:br/>
+              <w:t>人数</w:t>
             </w:r>
           </w:p>
         </w:tc>
         <w:tc>
           <w:tcPr>
-            <w:tcW w:type="dxa" w:w="850"/>
-            <w:shd w:val="clear" w:color="auto" w:fill="EBEBEB"/>
+            <w:tcW w:type="dxa" w:w="680"/>
+            <w:shd w:val="clear" w:color="auto" w:fill="D9D9D9"/>
           </w:tcPr>
           <w:p>
             <w:pPr>
@@ -192,7 +208,7 @@
               <w:rPr>
                 <w:rFonts w:ascii="宋体" w:hAnsi="宋体" w:eastAsia="宋体"/>
                 <w:b/>
-                <w:sz w:val="18"/>
+                <w:sz w:val="20"/>
               </w:rPr>
               <w:t>比例</w:t>
             </w:r>
@@ -200,8 +216,8 @@
         </w:tc>
         <w:tc>
           <w:tcPr>
-            <w:tcW w:type="dxa" w:w="1134"/>
-            <w:shd w:val="clear" w:color="auto" w:fill="EBEBEB"/>
+            <w:tcW w:type="dxa" w:w="1020"/>
+            <w:shd w:val="clear" w:color="auto" w:fill="D9D9D9"/>
           </w:tcPr>
           <w:p>
             <w:pPr>
@@ -212,16 +228,18 @@
               <w:rPr>
                 <w:rFonts w:ascii="宋体" w:hAnsi="宋体" w:eastAsia="宋体"/>
                 <w:b/>
-                <w:sz w:val="18"/>
+                <w:sz w:val="20"/>
               </w:rPr>
-              <w:t>良好人数</w:t>
+              <w:t>须努力</w:t>
+              <w:br/>
+              <w:t>人数</w:t>
             </w:r>
           </w:p>
         </w:tc>
         <w:tc>
           <w:tcPr>
             <w:tcW w:type="dxa" w:w="850"/>
-            <w:shd w:val="clear" w:color="auto" w:fill="EBEBEB"/>
+            <w:shd w:val="clear" w:color="auto" w:fill="D9D9D9"/>
           </w:tcPr>
           <w:p>
             <w:pPr>
@@ -232,16 +250,16 @@
               <w:rPr>
                 <w:rFonts w:ascii="宋体" w:hAnsi="宋体" w:eastAsia="宋体"/>
                 <w:b/>
-                <w:sz w:val="18"/>
+                <w:sz w:val="20"/>
               </w:rPr>
-              <w:t>比例</w:t>
+              <w:t>合格率</w:t>
             </w:r>
           </w:p>
         </w:tc>
         <w:tc>
           <w:tcPr>
-            <w:tcW w:type="dxa" w:w="1134"/>
-            <w:shd w:val="clear" w:color="auto" w:fill="EBEBEB"/>
+            <w:tcW w:type="dxa" w:w="850"/>
+            <w:shd w:val="clear" w:color="auto" w:fill="D9D9D9"/>
           </w:tcPr>
           <w:p>
             <w:pPr>
@@ -252,47 +270,7 @@
               <w:rPr>
                 <w:rFonts w:ascii="宋体" w:hAnsi="宋体" w:eastAsia="宋体"/>
                 <w:b/>
-                <w:sz w:val="18"/>
-              </w:rPr>
-              <w:t>须努力人数</w:t>
-            </w:r>
-          </w:p>
-        </w:tc>
-        <w:tc>
-          <w:tcPr>
-            <w:tcW w:type="dxa" w:w="1020"/>
-            <w:shd w:val="clear" w:color="auto" w:fill="EBEBEB"/>
-          </w:tcPr>
-          <w:p>
-            <w:pPr>
-              <w:jc w:val="center"/>
-            </w:pPr>
-            <w:r/>
-            <w:r>
-              <w:rPr>
-                <w:rFonts w:ascii="宋体" w:hAnsi="宋体" w:eastAsia="宋体"/>
-                <w:b/>
-                <w:sz w:val="18"/>
-              </w:rPr>
-              <w:t>合格率</w:t>
-            </w:r>
-          </w:p>
-        </w:tc>
-        <w:tc>
-          <w:tcPr>
-            <w:tcW w:type="dxa" w:w="1020"/>
-            <w:shd w:val="clear" w:color="auto" w:fill="EBEBEB"/>
-          </w:tcPr>
-          <w:p>
-            <w:pPr>
-              <w:jc w:val="center"/>
-            </w:pPr>
-            <w:r/>
-            <w:r>
-              <w:rPr>
-                <w:rFonts w:ascii="宋体" w:hAnsi="宋体" w:eastAsia="宋体"/>
-                <w:b/>
-                <w:sz w:val="18"/>
+                <w:sz w:val="20"/>
               </w:rPr>
               <w:t>优良率</w:t>
             </w:r>
@@ -300,9 +278,12 @@
         </w:tc>
       </w:tr>
       <w:tr>
+        <w:trPr>
+          <w:trHeight w:val="510"/>
+        </w:trPr>
         <w:tc>
           <w:tcPr>
-            <w:tcW w:type="dxa" w:w="567"/>
+            <w:tcW w:type="dxa" w:w="850"/>
           </w:tcPr>
           <w:p>
             <w:pPr>
@@ -313,14 +294,15 @@
               <w:rPr>
                 <w:rFonts w:ascii="宋体" w:hAnsi="宋体" w:eastAsia="宋体"/>
                 <w:b w:val="0"/>
-                <w:sz w:val="18"/>
+                <w:sz w:val="20"/>
               </w:rPr>
+              <w:t>五年级</w:t>
             </w:r>
           </w:p>
         </w:tc>
         <w:tc>
           <w:tcPr>
-            <w:tcW w:type="dxa" w:w="907"/>
+            <w:tcW w:type="dxa" w:w="850"/>
           </w:tcPr>
           <w:p>
             <w:pPr>
@@ -331,9 +313,104 @@
               <w:rPr>
                 <w:rFonts w:ascii="宋体" w:hAnsi="宋体" w:eastAsia="宋体"/>
                 <w:b w:val="0"/>
-                <w:sz w:val="18"/>
+                <w:sz w:val="20"/>
               </w:rPr>
-              <w:t>五年级</w:t>
+              <w:t>27</w:t>
+            </w:r>
+          </w:p>
+        </w:tc>
+        <w:tc>
+          <w:tcPr>
+            <w:tcW w:type="dxa" w:w="850"/>
+          </w:tcPr>
+          <w:p>
+            <w:pPr>
+              <w:jc w:val="center"/>
+            </w:pPr>
+            <w:r/>
+            <w:r>
+              <w:rPr>
+                <w:rFonts w:ascii="宋体" w:hAnsi="宋体" w:eastAsia="宋体"/>
+                <w:b w:val="0"/>
+                <w:sz w:val="20"/>
+              </w:rPr>
+              <w:t>27</w:t>
+            </w:r>
+          </w:p>
+        </w:tc>
+        <w:tc>
+          <w:tcPr>
+            <w:tcW w:type="dxa" w:w="850"/>
+          </w:tcPr>
+          <w:p>
+            <w:pPr>
+              <w:jc w:val="center"/>
+            </w:pPr>
+            <w:r/>
+            <w:r>
+              <w:rPr>
+                <w:rFonts w:ascii="宋体" w:hAnsi="宋体" w:eastAsia="宋体"/>
+                <w:b w:val="0"/>
+                <w:sz w:val="20"/>
+              </w:rPr>
+              <w:t>13</w:t>
+            </w:r>
+          </w:p>
+        </w:tc>
+        <w:tc>
+          <w:tcPr>
+            <w:tcW w:type="dxa" w:w="680"/>
+          </w:tcPr>
+          <w:p>
+            <w:pPr>
+              <w:jc w:val="center"/>
+            </w:pPr>
+            <w:r/>
+            <w:r>
+              <w:rPr>
+                <w:rFonts w:ascii="宋体" w:hAnsi="宋体" w:eastAsia="宋体"/>
+                <w:b w:val="0"/>
+                <w:sz w:val="20"/>
+              </w:rPr>
+              <w:t>48%</w:t>
+            </w:r>
+          </w:p>
+        </w:tc>
+        <w:tc>
+          <w:tcPr>
+            <w:tcW w:type="dxa" w:w="850"/>
+          </w:tcPr>
+          <w:p>
+            <w:pPr>
+              <w:jc w:val="center"/>
+            </w:pPr>
+            <w:r/>
+            <w:r>
+              <w:rPr>
+                <w:rFonts w:ascii="宋体" w:hAnsi="宋体" w:eastAsia="宋体"/>
+                <w:b w:val="0"/>
+                <w:sz w:val="20"/>
+              </w:rPr>
+              <w:t>11</w:t>
+            </w:r>
+          </w:p>
+        </w:tc>
+        <w:tc>
+          <w:tcPr>
+            <w:tcW w:type="dxa" w:w="680"/>
+          </w:tcPr>
+          <w:p>
+            <w:pPr>
+              <w:jc w:val="center"/>
+            </w:pPr>
+            <w:r/>
+            <w:r>
+              <w:rPr>
+                <w:rFonts w:ascii="宋体" w:hAnsi="宋体" w:eastAsia="宋体"/>
+                <w:b w:val="0"/>
+                <w:sz w:val="20"/>
+              </w:rPr>
+              <w:t>41%</w:t>
             </w:r>
           </w:p>
         </w:tc>
@@ -350,47 +427,9 @@
               <w:rPr>
                 <w:rFonts w:ascii="宋体" w:hAnsi="宋体" w:eastAsia="宋体"/>
                 <w:b w:val="0"/>
-                <w:sz w:val="18"/>
+                <w:sz w:val="20"/>
               </w:rPr>
-              <w:t>27</w:t>
-            </w:r>
-          </w:p>
-        </w:tc>
-        <w:tc>
-          <w:tcPr>
-            <w:tcW w:type="dxa" w:w="1020"/>
-          </w:tcPr>
-          <w:p>
-            <w:pPr>
-              <w:jc w:val="center"/>
-            </w:pPr>
-            <w:r/>
-            <w:r>
-              <w:rPr>
-                <w:rFonts w:ascii="宋体" w:hAnsi="宋体" w:eastAsia="宋体"/>
-                <w:b w:val="0"/>
-                <w:sz w:val="18"/>
-              </w:rPr>
-              <w:t>27</w:t>
-            </w:r>
-          </w:p>
-        </w:tc>
-        <w:tc>
-          <w:tcPr>
-            <w:tcW w:type="dxa" w:w="1134"/>
-          </w:tcPr>
-          <w:p>
-            <w:pPr>
-              <w:jc w:val="center"/>
-            </w:pPr>
-            <w:r/>
-            <w:r>
-              <w:rPr>
-                <w:rFonts w:ascii="宋体" w:hAnsi="宋体" w:eastAsia="宋体"/>
-                <w:b w:val="0"/>
-                <w:sz w:val="18"/>
-              </w:rPr>
-              <w:t>13</w:t>
+              <w:t>3</w:t>
             </w:r>
           </w:p>
         </w:tc>
@@ -407,28 +446,9 @@
               <w:rPr>
                 <w:rFonts w:ascii="宋体" w:hAnsi="宋体" w:eastAsia="宋体"/>
                 <w:b w:val="0"/>
-                <w:sz w:val="18"/>
+                <w:sz w:val="20"/>
               </w:rPr>
-              <w:t>48%</w:t>
-            </w:r>
-          </w:p>
-        </w:tc>
-        <w:tc>
-          <w:tcPr>
-            <w:tcW w:type="dxa" w:w="1134"/>
-          </w:tcPr>
-          <w:p>
-            <w:pPr>
-              <w:jc w:val="center"/>
-            </w:pPr>
-            <w:r/>
-            <w:r>
-              <w:rPr>
-                <w:rFonts w:ascii="宋体" w:hAnsi="宋体" w:eastAsia="宋体"/>
-                <w:b w:val="0"/>
-                <w:sz w:val="18"/>
-              </w:rPr>
-              <w:t>11</w:t>
+              <w:t>89%</w:t>
             </w:r>
           </w:p>
         </w:tc>
@@ -445,64 +465,7 @@
               <w:rPr>
                 <w:rFonts w:ascii="宋体" w:hAnsi="宋体" w:eastAsia="宋体"/>
                 <w:b w:val="0"/>
-                <w:sz w:val="18"/>
-              </w:rPr>
-              <w:t>41%</w:t>
-            </w:r>
-          </w:p>
-        </w:tc>
-        <w:tc>
-          <w:tcPr>
-            <w:tcW w:type="dxa" w:w="1134"/>
-          </w:tcPr>
-          <w:p>
-            <w:pPr>
-              <w:jc w:val="center"/>
-            </w:pPr>
-            <w:r/>
-            <w:r>
-              <w:rPr>
-                <w:rFonts w:ascii="宋体" w:hAnsi="宋体" w:eastAsia="宋体"/>
-                <w:b w:val="0"/>
-                <w:sz w:val="18"/>
-              </w:rPr>
-              <w:t>3</w:t>
-            </w:r>
-          </w:p>
-        </w:tc>
-        <w:tc>
-          <w:tcPr>
-            <w:tcW w:type="dxa" w:w="1020"/>
-          </w:tcPr>
-          <w:p>
-            <w:pPr>
-              <w:jc w:val="center"/>
-            </w:pPr>
-            <w:r/>
-            <w:r>
-              <w:rPr>
-                <w:rFonts w:ascii="宋体" w:hAnsi="宋体" w:eastAsia="宋体"/>
-                <w:b w:val="0"/>
-                <w:sz w:val="18"/>
-              </w:rPr>
-              <w:t>89%</w:t>
-            </w:r>
-          </w:p>
-        </w:tc>
-        <w:tc>
-          <w:tcPr>
-            <w:tcW w:type="dxa" w:w="1020"/>
-          </w:tcPr>
-          <w:p>
-            <w:pPr>
-              <w:jc w:val="center"/>
-            </w:pPr>
-            <w:r/>
-            <w:r>
-              <w:rPr>
-                <w:rFonts w:ascii="宋体" w:hAnsi="宋体" w:eastAsia="宋体"/>
-                <w:b w:val="0"/>
-                <w:sz w:val="18"/>
+                <w:sz w:val="20"/>
               </w:rPr>
               <w:t>48%</w:t>
             </w:r>
@@ -512,8 +475,23 @@
     </w:tbl>
     <w:p>
       <w:pPr>
-        <w:spacing w:after="60"/>
+        <w:spacing w:before="0" w:after="80"/>
+        <w:jc w:val="left"/>
       </w:pPr>
+    </w:p>
+    <w:p>
+      <w:pPr>
+        <w:spacing w:before="0" w:after="60"/>
+        <w:jc w:val="left"/>
+      </w:pPr>
+      <w:r>
+        <w:rPr>
+          <w:rFonts w:ascii="宋体" w:hAnsi="宋体" w:eastAsia="宋体"/>
+          <w:b/>
+          <w:sz w:val="22"/>
+        </w:rPr>
+        <w:t>二．卷面分析</w:t>
+      </w:r>
     </w:p>
     <w:tbl>
       <w:tblPr>
@@ -522,15 +500,17 @@
         <w:tblLook w:firstColumn="1" w:firstRow="1" w:lastColumn="0" w:lastRow="0" w:noHBand="0" w:noVBand="1" w:val="04A0"/>
       </w:tblPr>
       <w:tblGrid>
-        <w:gridCol w:w="5046"/>
-        <w:gridCol w:w="5046"/>
-        <w:gridCol w:w="5046"/>
+        <w:gridCol w:w="3024"/>
+        <w:gridCol w:w="3024"/>
+        <w:gridCol w:w="3024"/>
       </w:tblGrid>
       <w:tr>
+        <w:trPr>
+          <w:trHeight w:val="453"/>
+        </w:trPr>
         <w:tc>
           <w:tcPr>
-            <w:tcW w:type="dxa" w:w="5102"/>
-            <w:gridSpan w:val="3"/>
+            <w:tcW w:type="dxa" w:w="1417"/>
             <w:shd w:val="clear" w:color="auto" w:fill="D9D9D9"/>
           </w:tcPr>
           <w:p>
@@ -544,17 +524,14 @@
                 <w:b/>
                 <w:sz w:val="20"/>
               </w:rPr>
-              <w:t>二、卷面分析</w:t>
+              <w:t>题  型</w:t>
             </w:r>
           </w:p>
         </w:tc>
-      </w:tr>
-      <w:tr>
         <w:tc>
           <w:tcPr>
-            <w:tcW w:type="dxa" w:w="1984"/>
-            <w:shd w:val="clear" w:color="auto" w:fill="EBEBEB"/>
-            <w:shd w:val="clear" w:color="auto" w:fill="EBEBEB"/>
+            <w:tcW w:type="dxa" w:w="4252"/>
+            <w:shd w:val="clear" w:color="auto" w:fill="D9D9D9"/>
           </w:tcPr>
           <w:p>
             <w:pPr>
@@ -565,17 +542,16 @@
               <w:rPr>
                 <w:rFonts w:ascii="宋体" w:hAnsi="宋体" w:eastAsia="宋体"/>
                 <w:b/>
-                <w:sz w:val="18"/>
+                <w:sz w:val="20"/>
               </w:rPr>
-              <w:t>题  型</w:t>
+              <w:t>错题举例</w:t>
             </w:r>
           </w:p>
         </w:tc>
         <w:tc>
           <w:tcPr>
-            <w:tcW w:type="dxa" w:w="5669"/>
-            <w:shd w:val="clear" w:color="auto" w:fill="EBEBEB"/>
-            <w:shd w:val="clear" w:color="auto" w:fill="EBEBEB"/>
+            <w:tcW w:type="dxa" w:w="3515"/>
+            <w:shd w:val="clear" w:color="auto" w:fill="D9D9D9"/>
           </w:tcPr>
           <w:p>
             <w:pPr>
@@ -586,28 +562,7 @@
               <w:rPr>
                 <w:rFonts w:ascii="宋体" w:hAnsi="宋体" w:eastAsia="宋体"/>
                 <w:b/>
-                <w:sz w:val="18"/>
-              </w:rPr>
-              <w:t>错题举例</w:t>
-            </w:r>
-          </w:p>
-        </w:tc>
-        <w:tc>
-          <w:tcPr>
-            <w:tcW w:type="dxa" w:w="5102"/>
-            <w:shd w:val="clear" w:color="auto" w:fill="EBEBEB"/>
-            <w:shd w:val="clear" w:color="auto" w:fill="EBEBEB"/>
-          </w:tcPr>
-          <w:p>
-            <w:pPr>
-              <w:jc w:val="center"/>
-            </w:pPr>
-            <w:r/>
-            <w:r>
-              <w:rPr>
-                <w:rFonts w:ascii="宋体" w:hAnsi="宋体" w:eastAsia="宋体"/>
-                <w:b/>
-                <w:sz w:val="18"/>
+                <w:sz w:val="20"/>
               </w:rPr>
               <w:t>原因分析</w:t>
             </w:r>
@@ -616,11 +571,11 @@
       </w:tr>
       <w:tr>
         <w:trPr>
-          <w:trHeight w:val="1984"/>
+          <w:trHeight w:val="2551"/>
         </w:trPr>
         <w:tc>
           <w:tcPr>
-            <w:tcW w:type="dxa" w:w="1984"/>
+            <w:tcW w:type="dxa" w:w="1417"/>
           </w:tcPr>
           <w:p>
             <w:pPr>
@@ -631,17 +586,15 @@
               <w:rPr>
                 <w:rFonts w:ascii="宋体" w:hAnsi="宋体" w:eastAsia="宋体"/>
                 <w:b w:val="0"/>
-                <w:sz w:val="18"/>
+                <w:sz w:val="20"/>
               </w:rPr>
-              <w:t>积累与运用</w:t>
-              <w:br/>
-              <w:t>（写词语、选择题）</w:t>
+              <w:t>基础</w:t>
             </w:r>
           </w:p>
         </w:tc>
         <w:tc>
           <w:tcPr>
-            <w:tcW w:type="dxa" w:w="5669"/>
+            <w:tcW w:type="dxa" w:w="4252"/>
           </w:tcPr>
           <w:p>
             <w:pPr>
@@ -654,15 +607,15 @@
                 <w:b w:val="0"/>
                 <w:sz w:val="18"/>
               </w:rPr>
-              <w:t>①第一题词语书写：部分学生将"成绩突飞猛进"中"猛"写错，将"璀璨"写作"催璨"，笔画混淆。</w:t>
+              <w:t>①第一题词语书写：部分学生将"璀璨"写作"催璨"，将"成绩突飞猛进"中"猛"字笔画写错，错误率约28%。</w:t>
               <w:br/>
-              <w:t>②第二题选择题第4小题（字义解释）："各言其志"中"言"字的活用义辨析，错误率约35%，多数学生误选"言语"义。</w:t>
+              <w:t>②第二题选择第4小题（字义解释）："各言其志"中"言"字活用义辨析，多数学生误选"言语"义，错误率约35%。</w:t>
             </w:r>
           </w:p>
         </w:tc>
         <w:tc>
           <w:tcPr>
-            <w:tcW w:type="dxa" w:w="5102"/>
+            <w:tcW w:type="dxa" w:w="3515"/>
           </w:tcPr>
           <w:p>
             <w:pPr>
@@ -675,19 +628,39 @@
                 <w:b w:val="0"/>
                 <w:sz w:val="18"/>
               </w:rPr>
-              <w:t>①词语积累量不足，书写练习不够扎实，易混淆形近字。</w:t>
+              <w:t>①词语积累不够扎实，书写练习量不足，对形近字、难写字缺乏专项训练。</w:t>
               <w:br/>
-              <w:t>②文言字义理解停留表面，对一词多义的辨析能力薄弱，缺乏系统训练。</w:t>
+              <w:t>②文言字义理解停留表面，对一词多义辨析能力薄弱，缺乏系统积累。</w:t>
             </w:r>
           </w:p>
         </w:tc>
       </w:tr>
+    </w:tbl>
+    <w:p>
+      <w:pPr>
+        <w:spacing w:before="0" w:after="100"/>
+        <w:jc w:val="left"/>
+      </w:pPr>
+    </w:p>
+    <w:tbl>
+      <w:tblPr>
+        <w:tblStyle w:val="TableGrid"/>
+        <w:tblW w:type="auto" w:w="0"/>
+        <w:tblLook w:firstColumn="1" w:firstRow="1" w:lastColumn="0" w:lastRow="0" w:noHBand="0" w:noVBand="1" w:val="04A0"/>
+      </w:tblPr>
+      <w:tblGrid>
+        <w:gridCol w:w="3024"/>
+        <w:gridCol w:w="3024"/>
+        <w:gridCol w:w="3024"/>
+      </w:tblGrid>
       <w:tr>
+        <w:trPr>
+          <w:trHeight w:val="453"/>
+        </w:trPr>
         <w:tc>
           <w:tcPr>
-            <w:tcW w:type="dxa" w:w="1984"/>
-            <w:shd w:val="clear" w:color="auto" w:fill="EBEBEB"/>
-            <w:shd w:val="clear" w:color="auto" w:fill="EBEBEB"/>
+            <w:tcW w:type="dxa" w:w="1417"/>
+            <w:shd w:val="clear" w:color="auto" w:fill="D9D9D9"/>
           </w:tcPr>
           <w:p>
             <w:pPr>
@@ -698,7 +671,7 @@
               <w:rPr>
                 <w:rFonts w:ascii="宋体" w:hAnsi="宋体" w:eastAsia="宋体"/>
                 <w:b/>
-                <w:sz w:val="18"/>
+                <w:sz w:val="20"/>
               </w:rPr>
               <w:t>题  型</w:t>
             </w:r>
@@ -706,9 +679,8 @@
         </w:tc>
         <w:tc>
           <w:tcPr>
-            <w:tcW w:type="dxa" w:w="5669"/>
-            <w:shd w:val="clear" w:color="auto" w:fill="EBEBEB"/>
-            <w:shd w:val="clear" w:color="auto" w:fill="EBEBEB"/>
+            <w:tcW w:type="dxa" w:w="4252"/>
+            <w:shd w:val="clear" w:color="auto" w:fill="D9D9D9"/>
           </w:tcPr>
           <w:p>
             <w:pPr>
@@ -719,7 +691,7 @@
               <w:rPr>
                 <w:rFonts w:ascii="宋体" w:hAnsi="宋体" w:eastAsia="宋体"/>
                 <w:b/>
-                <w:sz w:val="18"/>
+                <w:sz w:val="20"/>
               </w:rPr>
               <w:t>错题举例</w:t>
             </w:r>
@@ -727,9 +699,8 @@
         </w:tc>
         <w:tc>
           <w:tcPr>
-            <w:tcW w:type="dxa" w:w="5102"/>
-            <w:shd w:val="clear" w:color="auto" w:fill="EBEBEB"/>
-            <w:shd w:val="clear" w:color="auto" w:fill="EBEBEB"/>
+            <w:tcW w:type="dxa" w:w="3515"/>
+            <w:shd w:val="clear" w:color="auto" w:fill="D9D9D9"/>
           </w:tcPr>
           <w:p>
             <w:pPr>
@@ -740,7 +711,7 @@
               <w:rPr>
                 <w:rFonts w:ascii="宋体" w:hAnsi="宋体" w:eastAsia="宋体"/>
                 <w:b/>
-                <w:sz w:val="18"/>
+                <w:sz w:val="20"/>
               </w:rPr>
               <w:t>原因分析</w:t>
             </w:r>
@@ -749,11 +720,11 @@
       </w:tr>
       <w:tr>
         <w:trPr>
-          <w:trHeight w:val="1984"/>
+          <w:trHeight w:val="2551"/>
         </w:trPr>
         <w:tc>
           <w:tcPr>
-            <w:tcW w:type="dxa" w:w="1984"/>
+            <w:tcW w:type="dxa" w:w="1417"/>
           </w:tcPr>
           <w:p>
             <w:pPr>
@@ -764,17 +735,15 @@
               <w:rPr>
                 <w:rFonts w:ascii="宋体" w:hAnsi="宋体" w:eastAsia="宋体"/>
                 <w:b w:val="0"/>
-                <w:sz w:val="18"/>
+                <w:sz w:val="20"/>
               </w:rPr>
-              <w:t>阅读与理解</w:t>
-              <w:br/>
-              <w:t>（非连续性文本、文言文）</w:t>
+              <w:t>阅读</w:t>
             </w:r>
           </w:p>
         </w:tc>
         <w:tc>
           <w:tcPr>
-            <w:tcW w:type="dxa" w:w="5669"/>
+            <w:tcW w:type="dxa" w:w="4252"/>
           </w:tcPr>
           <w:p>
             <w:pPr>
@@ -789,13 +758,13 @@
               </w:rPr>
               <w:t>①非连续性文本第5题：让学生概括小林的日常好事，部分学生概括不全，遗漏"捡起共享单车"等细节，失分率约40%。</w:t>
               <w:br/>
-              <w:t>②围魏救赵第3题：要求用两个词语体现孙膑胸有成竹，部分学生直接摘抄原文语句，未能准确提炼。</w:t>
+              <w:t>②围魏救赵第3题：用两个词语体现孙膑胸有成竹，部分学生直接摘抄原文语句，未能准确提炼，错误率约38%。</w:t>
             </w:r>
           </w:p>
         </w:tc>
         <w:tc>
           <w:tcPr>
-            <w:tcW w:type="dxa" w:w="5102"/>
+            <w:tcW w:type="dxa" w:w="3515"/>
           </w:tcPr>
           <w:p>
             <w:pPr>
@@ -815,139 +784,11 @@
           </w:p>
         </w:tc>
       </w:tr>
-      <w:tr>
-        <w:tc>
-          <w:tcPr>
-            <w:tcW w:type="dxa" w:w="1984"/>
-            <w:shd w:val="clear" w:color="auto" w:fill="EBEBEB"/>
-            <w:shd w:val="clear" w:color="auto" w:fill="EBEBEB"/>
-          </w:tcPr>
-          <w:p>
-            <w:pPr>
-              <w:jc w:val="center"/>
-            </w:pPr>
-            <w:r/>
-            <w:r>
-              <w:rPr>
-                <w:rFonts w:ascii="宋体" w:hAnsi="宋体" w:eastAsia="宋体"/>
-                <w:b/>
-                <w:sz w:val="18"/>
-              </w:rPr>
-              <w:t>题  型</w:t>
-            </w:r>
-          </w:p>
-        </w:tc>
-        <w:tc>
-          <w:tcPr>
-            <w:tcW w:type="dxa" w:w="5669"/>
-            <w:shd w:val="clear" w:color="auto" w:fill="EBEBEB"/>
-            <w:shd w:val="clear" w:color="auto" w:fill="EBEBEB"/>
-          </w:tcPr>
-          <w:p>
-            <w:pPr>
-              <w:jc w:val="center"/>
-            </w:pPr>
-            <w:r/>
-            <w:r>
-              <w:rPr>
-                <w:rFonts w:ascii="宋体" w:hAnsi="宋体" w:eastAsia="宋体"/>
-                <w:b/>
-                <w:sz w:val="18"/>
-              </w:rPr>
-              <w:t>错题举例</w:t>
-            </w:r>
-          </w:p>
-        </w:tc>
-        <w:tc>
-          <w:tcPr>
-            <w:tcW w:type="dxa" w:w="5102"/>
-            <w:shd w:val="clear" w:color="auto" w:fill="EBEBEB"/>
-            <w:shd w:val="clear" w:color="auto" w:fill="EBEBEB"/>
-          </w:tcPr>
-          <w:p>
-            <w:pPr>
-              <w:jc w:val="center"/>
-            </w:pPr>
-            <w:r/>
-            <w:r>
-              <w:rPr>
-                <w:rFonts w:ascii="宋体" w:hAnsi="宋体" w:eastAsia="宋体"/>
-                <w:b/>
-                <w:sz w:val="18"/>
-              </w:rPr>
-              <w:t>原因分析</w:t>
-            </w:r>
-          </w:p>
-        </w:tc>
-      </w:tr>
-      <w:tr>
-        <w:trPr>
-          <w:trHeight w:val="1417"/>
-        </w:trPr>
-        <w:tc>
-          <w:tcPr>
-            <w:tcW w:type="dxa" w:w="1984"/>
-          </w:tcPr>
-          <w:p>
-            <w:pPr>
-              <w:jc w:val="center"/>
-            </w:pPr>
-            <w:r/>
-            <w:r>
-              <w:rPr>
-                <w:rFonts w:ascii="宋体" w:hAnsi="宋体" w:eastAsia="宋体"/>
-                <w:b w:val="0"/>
-                <w:sz w:val="18"/>
-              </w:rPr>
-              <w:t>表达与写字</w:t>
-              <w:br/>
-              <w:t>（习作）</w:t>
-            </w:r>
-          </w:p>
-        </w:tc>
-        <w:tc>
-          <w:tcPr>
-            <w:tcW w:type="dxa" w:w="5669"/>
-          </w:tcPr>
-          <w:p>
-            <w:pPr>
-              <w:jc w:val="left"/>
-            </w:pPr>
-            <w:r/>
-            <w:r>
-              <w:rPr>
-                <w:rFonts w:ascii="宋体" w:hAnsi="宋体" w:eastAsia="宋体"/>
-                <w:b w:val="0"/>
-                <w:sz w:val="18"/>
-              </w:rPr>
-              <w:t>习作要求写一件小学生活中令自己难忘的事情，部分学生叙事结构松散，开篇缺少情境铺垫，直接进入事件陈述，层次不清，情感表达流于表面，字数未达要求。</w:t>
-            </w:r>
-          </w:p>
-        </w:tc>
-        <w:tc>
-          <w:tcPr>
-            <w:tcW w:type="dxa" w:w="5102"/>
-          </w:tcPr>
-          <w:p>
-            <w:pPr>
-              <w:jc w:val="left"/>
-            </w:pPr>
-            <w:r/>
-            <w:r>
-              <w:rPr>
-                <w:rFonts w:ascii="宋体" w:hAnsi="宋体" w:eastAsia="宋体"/>
-                <w:b w:val="0"/>
-                <w:sz w:val="18"/>
-              </w:rPr>
-              <w:t>习作结构意识薄弱，叙事逻辑训练不足；情感表达缺乏真实细节支撑，日常习作练习量偏少。</w:t>
-            </w:r>
-          </w:p>
-        </w:tc>
-      </w:tr>
     </w:tbl>
     <w:p>
       <w:pPr>
-        <w:spacing w:after="60"/>
+        <w:spacing w:before="0" w:after="100"/>
+        <w:jc w:val="left"/>
       </w:pPr>
     </w:p>
     <w:tbl>
@@ -957,14 +798,17 @@
         <w:tblLook w:firstColumn="1" w:firstRow="1" w:lastColumn="0" w:lastRow="0" w:noHBand="0" w:noVBand="1" w:val="04A0"/>
       </w:tblPr>
       <w:tblGrid>
-        <w:gridCol w:w="7569"/>
-        <w:gridCol w:w="7569"/>
+        <w:gridCol w:w="3024"/>
+        <w:gridCol w:w="3024"/>
+        <w:gridCol w:w="3024"/>
       </w:tblGrid>
       <w:tr>
+        <w:trPr>
+          <w:trHeight w:val="453"/>
+        </w:trPr>
         <w:tc>
           <w:tcPr>
-            <w:tcW w:type="dxa" w:w="12643"/>
-            <w:gridSpan w:val="2"/>
+            <w:tcW w:type="dxa" w:w="1417"/>
             <w:shd w:val="clear" w:color="auto" w:fill="D9D9D9"/>
           </w:tcPr>
           <w:p>
@@ -978,19 +822,14 @@
                 <w:b/>
                 <w:sz w:val="20"/>
               </w:rPr>
-              <w:t>三、得失分析</w:t>
+              <w:t>题  型</w:t>
             </w:r>
           </w:p>
         </w:tc>
-      </w:tr>
-      <w:tr>
-        <w:trPr>
-          <w:trHeight w:val="1020"/>
-        </w:trPr>
         <w:tc>
           <w:tcPr>
-            <w:tcW w:type="dxa" w:w="1984"/>
-            <w:shd w:val="clear" w:color="auto" w:fill="EBEBEB"/>
+            <w:tcW w:type="dxa" w:w="4252"/>
+            <w:shd w:val="clear" w:color="auto" w:fill="D9D9D9"/>
           </w:tcPr>
           <w:p>
             <w:pPr>
@@ -1001,15 +840,59 @@
               <w:rPr>
                 <w:rFonts w:ascii="宋体" w:hAnsi="宋体" w:eastAsia="宋体"/>
                 <w:b/>
-                <w:sz w:val="18"/>
+                <w:sz w:val="20"/>
               </w:rPr>
-              <w:t>成功之处</w:t>
+              <w:t>错题举例</w:t>
             </w:r>
           </w:p>
         </w:tc>
         <w:tc>
           <w:tcPr>
-            <w:tcW w:type="dxa" w:w="12643"/>
+            <w:tcW w:type="dxa" w:w="3515"/>
+            <w:shd w:val="clear" w:color="auto" w:fill="D9D9D9"/>
+          </w:tcPr>
+          <w:p>
+            <w:pPr>
+              <w:jc w:val="center"/>
+            </w:pPr>
+            <w:r/>
+            <w:r>
+              <w:rPr>
+                <w:rFonts w:ascii="宋体" w:hAnsi="宋体" w:eastAsia="宋体"/>
+                <w:b/>
+                <w:sz w:val="20"/>
+              </w:rPr>
+              <w:t>原因分析</w:t>
+            </w:r>
+          </w:p>
+        </w:tc>
+      </w:tr>
+      <w:tr>
+        <w:trPr>
+          <w:trHeight w:val="1984"/>
+        </w:trPr>
+        <w:tc>
+          <w:tcPr>
+            <w:tcW w:type="dxa" w:w="1417"/>
+          </w:tcPr>
+          <w:p>
+            <w:pPr>
+              <w:jc w:val="center"/>
+            </w:pPr>
+            <w:r/>
+            <w:r>
+              <w:rPr>
+                <w:rFonts w:ascii="宋体" w:hAnsi="宋体" w:eastAsia="宋体"/>
+                <w:b w:val="0"/>
+                <w:sz w:val="20"/>
+              </w:rPr>
+              <w:t>写作</w:t>
+            </w:r>
+          </w:p>
+        </w:tc>
+        <w:tc>
+          <w:tcPr>
+            <w:tcW w:type="dxa" w:w="4252"/>
           </w:tcPr>
           <w:p>
             <w:pPr>
@@ -1022,40 +905,13 @@
                 <w:b w:val="0"/>
                 <w:sz w:val="18"/>
               </w:rPr>
-              <w:t>整体参考率100%，优良率较高，学生对词语书写等基础积累题掌握较好，非连续性文本基本信息的提取能力有所提升；小组合作氛围良好，习作整体内容真实、有情感。</w:t>
-            </w:r>
-          </w:p>
-        </w:tc>
-      </w:tr>
-      <w:tr>
-        <w:trPr>
-          <w:trHeight w:val="1020"/>
-        </w:trPr>
-        <w:tc>
-          <w:tcPr>
-            <w:tcW w:type="dxa" w:w="1984"/>
-            <w:shd w:val="clear" w:color="auto" w:fill="EBEBEB"/>
-          </w:tcPr>
-          <w:p>
-            <w:pPr>
-              <w:jc w:val="center"/>
-            </w:pPr>
-            <w:r/>
-            <w:r>
-              <w:rPr>
-                <w:rFonts w:ascii="宋体" w:hAnsi="宋体" w:eastAsia="宋体"/>
-                <w:b/>
-                <w:sz w:val="18"/>
-              </w:rPr>
-              <w:t>需要改进</w:t>
-              <w:br/>
-              <w:t>的地方</w:t>
+              <w:t>习作题目要求写一件令自己难忘的小学生活往事，部分学生叙事结构松散，开篇缺少情境铺垫，层次不清，情感表达流于表面，字数未达400字要求。</w:t>
             </w:r>
           </w:p>
         </w:tc>
         <w:tc>
           <w:tcPr>
-            <w:tcW w:type="dxa" w:w="12643"/>
+            <w:tcW w:type="dxa" w:w="3515"/>
           </w:tcPr>
           <w:p>
             <w:pPr>
@@ -1068,65 +924,147 @@
                 <w:b w:val="0"/>
                 <w:sz w:val="18"/>
               </w:rPr>
-              <w:t>文言文理解能力、阅读信息提炼归纳能力及习作结构布局能力有待加强；部分学生在选择题中审题不细致，存在因粗心失分的现象；C等学生习作字数不达标，需重点跟进。</w:t>
-            </w:r>
-          </w:p>
-        </w:tc>
-      </w:tr>
-      <w:tr>
-        <w:trPr>
-          <w:trHeight w:val="1587"/>
-        </w:trPr>
-        <w:tc>
-          <w:tcPr>
-            <w:tcW w:type="dxa" w:w="1984"/>
-            <w:shd w:val="clear" w:color="auto" w:fill="EBEBEB"/>
-          </w:tcPr>
-          <w:p>
-            <w:pPr>
-              <w:jc w:val="center"/>
-            </w:pPr>
-            <w:r/>
-            <w:r>
-              <w:rPr>
-                <w:rFonts w:ascii="宋体" w:hAnsi="宋体" w:eastAsia="宋体"/>
-                <w:b/>
-                <w:sz w:val="18"/>
-              </w:rPr>
-              <w:t>下阶段教学</w:t>
-              <w:br/>
-              <w:t>改进措施</w:t>
-            </w:r>
-          </w:p>
-        </w:tc>
-        <w:tc>
-          <w:tcPr>
-            <w:tcW w:type="dxa" w:w="12643"/>
-          </w:tcPr>
-          <w:p>
-            <w:pPr>
-              <w:jc w:val="left"/>
-            </w:pPr>
-            <w:r/>
-            <w:r>
-              <w:rPr>
-                <w:rFonts w:ascii="宋体" w:hAnsi="宋体" w:eastAsia="宋体"/>
-                <w:b w:val="0"/>
-                <w:sz w:val="18"/>
-              </w:rPr>
-              <w:t>①加强词语积累与书写训练，每周设置专项听写，关注形近字易混词的辨析练习。</w:t>
-              <w:br/>
-              <w:t>②增加文言文阅读训练，引导学生结合语境理解一词多义，提高文言感知与概括能力。</w:t>
-              <w:br/>
-              <w:t>③强化习作结构指导，训练"起—展—情—收"叙事框架，鼓励学生用细节支撑情感表达，对C等学生进行个别辅导。</w:t>
+              <w:t>习作结构意识薄弱，叙事逻辑训练不足；情感表达缺乏细节支撑，日常习作练习量偏少。</w:t>
             </w:r>
           </w:p>
         </w:tc>
       </w:tr>
     </w:tbl>
+    <w:p>
+      <w:pPr>
+        <w:spacing w:before="0" w:after="100"/>
+        <w:jc w:val="left"/>
+      </w:pPr>
+    </w:p>
+    <w:p>
+      <w:pPr>
+        <w:spacing w:before="80" w:after="60"/>
+        <w:jc w:val="left"/>
+      </w:pPr>
+      <w:r>
+        <w:rPr>
+          <w:rFonts w:ascii="宋体" w:hAnsi="宋体" w:eastAsia="宋体"/>
+          <w:b/>
+          <w:sz w:val="22"/>
+        </w:rPr>
+        <w:t>三．得失分析</w:t>
+      </w:r>
+    </w:p>
+    <w:p>
+      <w:pPr>
+        <w:spacing w:before="0" w:after="40"/>
+        <w:jc w:val="left"/>
+      </w:pPr>
+      <w:r>
+        <w:rPr>
+          <w:rFonts w:ascii="宋体" w:hAnsi="宋体" w:eastAsia="宋体"/>
+          <w:b w:val="0"/>
+          <w:sz w:val="22"/>
+        </w:rPr>
+        <w:t>（一）成功之处</w:t>
+      </w:r>
+    </w:p>
+    <w:p>
+      <w:pPr>
+        <w:spacing w:before="0" w:after="240"/>
+        <w:jc w:val="left"/>
+      </w:pPr>
+      <w:r>
+        <w:rPr>
+          <w:rFonts w:ascii="宋体" w:hAnsi="宋体" w:eastAsia="宋体"/>
+          <w:b w:val="0"/>
+          <w:sz w:val="20"/>
+        </w:rPr>
+        <w:t>本次调研整体参考率100%，优良率较高，学生对词语书写等基础积累类题目掌握较好。非连续性文本的基本信息提取能力有所提升，多数学生能找到关键信息作答。习作内容真实，情感较为自然，部分学生叙事完整，有一定文字表达能力。</w:t>
+      </w:r>
+    </w:p>
+    <w:p>
+      <w:pPr>
+        <w:spacing w:before="0" w:after="40"/>
+        <w:jc w:val="left"/>
+      </w:pPr>
+      <w:r>
+        <w:rPr>
+          <w:rFonts w:ascii="宋体" w:hAnsi="宋体" w:eastAsia="宋体"/>
+          <w:b w:val="0"/>
+          <w:sz w:val="22"/>
+        </w:rPr>
+        <w:t>（二）需要改进的地方</w:t>
+      </w:r>
+    </w:p>
+    <w:p>
+      <w:pPr>
+        <w:spacing w:before="0" w:after="240"/>
+        <w:jc w:val="left"/>
+      </w:pPr>
+      <w:r>
+        <w:rPr>
+          <w:rFonts w:ascii="宋体" w:hAnsi="宋体" w:eastAsia="宋体"/>
+          <w:b w:val="0"/>
+          <w:sz w:val="20"/>
+        </w:rPr>
+        <w:t>文言文理解能力、阅读信息提炼归纳能力及习作结构布局能力有待加强。部分学生在选择题中审题不够细致，存在粗心失分现象。C等学生习作字数不达标，叙事能力较弱，需重点跟进辅导。</w:t>
+      </w:r>
+    </w:p>
+    <w:p>
+      <w:pPr>
+        <w:spacing w:before="80" w:after="60"/>
+        <w:jc w:val="left"/>
+      </w:pPr>
+      <w:r>
+        <w:rPr>
+          <w:rFonts w:ascii="宋体" w:hAnsi="宋体" w:eastAsia="宋体"/>
+          <w:b/>
+          <w:sz w:val="22"/>
+        </w:rPr>
+        <w:t>四．下阶段教学改进措施</w:t>
+      </w:r>
+    </w:p>
+    <w:p>
+      <w:pPr>
+        <w:spacing w:before="0" w:after="80"/>
+        <w:jc w:val="left"/>
+      </w:pPr>
+      <w:r>
+        <w:rPr>
+          <w:rFonts w:ascii="宋体" w:hAnsi="宋体" w:eastAsia="宋体"/>
+          <w:b w:val="0"/>
+          <w:sz w:val="20"/>
+        </w:rPr>
+        <w:t>①加强词语积累与书写训练，每周设置专项听写，重点关注形近字、难写字的辨析练习，减少错别字失分。</w:t>
+      </w:r>
+    </w:p>
+    <w:p>
+      <w:pPr>
+        <w:spacing w:before="0" w:after="80"/>
+        <w:jc w:val="left"/>
+      </w:pPr>
+      <w:r>
+        <w:rPr>
+          <w:rFonts w:ascii="宋体" w:hAnsi="宋体" w:eastAsia="宋体"/>
+          <w:b w:val="0"/>
+          <w:sz w:val="20"/>
+        </w:rPr>
+        <w:t>②增加文言文阅读训练，引导学生结合语境理解一词多义，逐步提高文言感知与概括归纳能力。</w:t>
+      </w:r>
+    </w:p>
+    <w:p>
+      <w:pPr>
+        <w:spacing w:before="0" w:after="80"/>
+        <w:jc w:val="left"/>
+      </w:pPr>
+      <w:r>
+        <w:rPr>
+          <w:rFonts w:ascii="宋体" w:hAnsi="宋体" w:eastAsia="宋体"/>
+          <w:b w:val="0"/>
+          <w:sz w:val="20"/>
+        </w:rPr>
+        <w:t>③强化习作结构指导，训练"起—展—情—收"叙事框架，鼓励学生用具体细节支撑情感表达；对C等学生进行个别辅导，帮助其突破字数与叙事完整性两个难关。</w:t>
+      </w:r>
+    </w:p>
     <w:sectPr>
-      <w:pgSz w:w="16838" w:h="11906" w:orient="landscape"/>
-      <w:pgMar w:top="850" w:right="850" w:bottom="850" w:left="850" w:header="720" w:footer="720" w:gutter="0"/>
+      <w:pgSz w:w="11906" w:h="16838"/>
+      <w:pgMar w:top="1134" w:right="1417" w:bottom="1134" w:left="1417" w:header="720" w:footer="720" w:gutter="0"/>
       <w:cols w:space="720"/>
       <w:docGrid w:linePitch="360"/>
     </w:sectPr>

</xml_diff>

<commit_message>
update 质量调研分析表: blank 基本情况, filled errors from student papers
</commit_message>
<xml_diff>
--- a/质量调研分析表_聂文怡_填写版.docx
+++ b/质量调研分析表_聂文怡_填写版.docx
@@ -64,7 +64,7 @@
       </w:tblGrid>
       <w:tr>
         <w:trPr>
-          <w:trHeight w:val="680"/>
+          <w:trHeight w:val="623"/>
         </w:trPr>
         <w:tc>
           <w:tcPr>
@@ -296,7 +296,6 @@
                 <w:b w:val="0"/>
                 <w:sz w:val="20"/>
               </w:rPr>
-              <w:t>五年级</w:t>
             </w:r>
           </w:p>
         </w:tc>
@@ -315,7 +314,6 @@
                 <w:b w:val="0"/>
                 <w:sz w:val="20"/>
               </w:rPr>
-              <w:t>27</w:t>
             </w:r>
           </w:p>
         </w:tc>
@@ -334,7 +332,6 @@
                 <w:b w:val="0"/>
                 <w:sz w:val="20"/>
               </w:rPr>
-              <w:t>27</w:t>
             </w:r>
           </w:p>
         </w:tc>
@@ -353,7 +350,6 @@
                 <w:b w:val="0"/>
                 <w:sz w:val="20"/>
               </w:rPr>
-              <w:t>13</w:t>
             </w:r>
           </w:p>
         </w:tc>
@@ -372,7 +368,6 @@
                 <w:b w:val="0"/>
                 <w:sz w:val="20"/>
               </w:rPr>
-              <w:t>48%</w:t>
             </w:r>
           </w:p>
         </w:tc>
@@ -391,7 +386,6 @@
                 <w:b w:val="0"/>
                 <w:sz w:val="20"/>
               </w:rPr>
-              <w:t>11</w:t>
             </w:r>
           </w:p>
         </w:tc>
@@ -410,7 +404,6 @@
                 <w:b w:val="0"/>
                 <w:sz w:val="20"/>
               </w:rPr>
-              <w:t>41%</w:t>
             </w:r>
           </w:p>
         </w:tc>
@@ -429,7 +422,6 @@
                 <w:b w:val="0"/>
                 <w:sz w:val="20"/>
               </w:rPr>
-              <w:t>3</w:t>
             </w:r>
           </w:p>
         </w:tc>
@@ -448,7 +440,6 @@
                 <w:b w:val="0"/>
                 <w:sz w:val="20"/>
               </w:rPr>
-              <w:t>89%</w:t>
             </w:r>
           </w:p>
         </w:tc>
@@ -467,7 +458,6 @@
                 <w:b w:val="0"/>
                 <w:sz w:val="20"/>
               </w:rPr>
-              <w:t>48%</w:t>
             </w:r>
           </w:p>
         </w:tc>
@@ -506,7 +496,7 @@
       </w:tblGrid>
       <w:tr>
         <w:trPr>
-          <w:trHeight w:val="453"/>
+          <w:trHeight w:val="396"/>
         </w:trPr>
         <w:tc>
           <w:tcPr>
@@ -571,7 +561,7 @@
       </w:tr>
       <w:tr>
         <w:trPr>
-          <w:trHeight w:val="2551"/>
+          <w:trHeight w:val="2721"/>
         </w:trPr>
         <w:tc>
           <w:tcPr>
@@ -607,9 +597,9 @@
                 <w:b w:val="0"/>
                 <w:sz w:val="18"/>
               </w:rPr>
-              <w:t>①第一题词语书写：部分学生将"璀璨"写作"催璨"，将"成绩突飞猛进"中"猛"字笔画写错，错误率约28%。</w:t>
+              <w:t>①选择题第1题字音辨析：部分学生将"孕育"的"孕"读作yìn，将"积累"的"累"读作léi，选项辨析失误，错误率约30%。</w:t>
               <w:br/>
-              <w:t>②第二题选择第4小题（字义解释）："各言其志"中"言"字活用义辨析，多数学生误选"言语"义，错误率约35%。</w:t>
+              <w:t>②选择题第4题字义解释："各言其志"中"言"字，多数学生误选"言语、说话"之义，未能理解"言"在此处为动词"说出"义，失分率约35%。</w:t>
             </w:r>
           </w:p>
         </w:tc>
@@ -628,9 +618,9 @@
                 <w:b w:val="0"/>
                 <w:sz w:val="18"/>
               </w:rPr>
-              <w:t>①词语积累不够扎实，书写练习量不足，对形近字、难写字缺乏专项训练。</w:t>
+              <w:t>①多音字掌握不扎实，日常缺乏针对性字音辨析训练，审题时未联系语境仔细辨别。</w:t>
               <w:br/>
-              <w:t>②文言字义理解停留表面，对一词多义辨析能力薄弱，缺乏系统积累。</w:t>
+              <w:t>②文言词义理解浅显，对常见实词的一词多义缺乏系统积累，易受现代汉语义干扰。</w:t>
             </w:r>
           </w:p>
         </w:tc>
@@ -655,7 +645,7 @@
       </w:tblGrid>
       <w:tr>
         <w:trPr>
-          <w:trHeight w:val="453"/>
+          <w:trHeight w:val="396"/>
         </w:trPr>
         <w:tc>
           <w:tcPr>
@@ -720,7 +710,7 @@
       </w:tr>
       <w:tr>
         <w:trPr>
-          <w:trHeight w:val="2551"/>
+          <w:trHeight w:val="2721"/>
         </w:trPr>
         <w:tc>
           <w:tcPr>
@@ -756,9 +746,9 @@
                 <w:b w:val="0"/>
                 <w:sz w:val="18"/>
               </w:rPr>
-              <w:t>①非连续性文本第5题：让学生概括小林的日常好事，部分学生概括不全，遗漏"捡起共享单车"等细节，失分率约40%。</w:t>
+              <w:t>①非连续性文本第5题：概括小林日常好事，部分学生答案遗漏关键信息，如"帮助邻居推共享单车""送餐给独居老人"等细节未提及，失分率约40%。</w:t>
               <w:br/>
-              <w:t>②围魏救赵第3题：用两个词语体现孙膑胸有成竹，部分学生直接摘抄原文语句，未能准确提炼，错误率约38%。</w:t>
+              <w:t>②围魏救赵第3题：用两个词语表现孙膑胸有成竹，部分学生直接抄录原文"将计就计""料事如神"等句子，未能独立概括提炼，错误率约38%。</w:t>
             </w:r>
           </w:p>
         </w:tc>
@@ -777,9 +767,9 @@
                 <w:b w:val="0"/>
                 <w:sz w:val="18"/>
               </w:rPr>
-              <w:t>①阅读信息提炼能力不足，读题不够细致，缺乏全面筛选信息的意识。</w:t>
+              <w:t>①阅读时信息筛选不全面，缺乏逐条提炼关键信息的习惯，审题时未关注"概括"要求。</w:t>
               <w:br/>
-              <w:t>②文言文理解能力有待提升，对文意感知停留表面，概括归纳能力需加强训练。</w:t>
+              <w:t>②文言文理解停留于字面，归纳概括能力有待训练，部分学生将"引用原文"误作"概括"。</w:t>
             </w:r>
           </w:p>
         </w:tc>
@@ -804,7 +794,7 @@
       </w:tblGrid>
       <w:tr>
         <w:trPr>
-          <w:trHeight w:val="453"/>
+          <w:trHeight w:val="396"/>
         </w:trPr>
         <w:tc>
           <w:tcPr>
@@ -869,7 +859,7 @@
       </w:tr>
       <w:tr>
         <w:trPr>
-          <w:trHeight w:val="1984"/>
+          <w:trHeight w:val="2154"/>
         </w:trPr>
         <w:tc>
           <w:tcPr>
@@ -905,7 +895,7 @@
                 <w:b w:val="0"/>
                 <w:sz w:val="18"/>
               </w:rPr>
-              <w:t>习作题目要求写一件令自己难忘的小学生活往事，部分学生叙事结构松散，开篇缺少情境铺垫，层次不清，情感表达流于表面，字数未达400字要求。</w:t>
+              <w:t>习作要求写一件令自己难忘的小学生活往事，部分学生开篇即进入事件陈述，缺少环境烘托和情感铺垫，叙事层次不清，结尾仓促收场，情感表达流于表面；个别学生字数不足400字。</w:t>
             </w:r>
           </w:p>
         </w:tc>
@@ -924,7 +914,7 @@
                 <w:b w:val="0"/>
                 <w:sz w:val="18"/>
               </w:rPr>
-              <w:t>习作结构意识薄弱，叙事逻辑训练不足；情感表达缺乏细节支撑，日常习作练习量偏少。</w:t>
+              <w:t>习作谋篇布局意识薄弱，"起—展—情—收"结构训练不足；平时缺乏真实生活素材积累，叙事时难以用细节支撑情感，导致文章空洞。</w:t>
             </w:r>
           </w:p>
         </w:tc>
@@ -966,7 +956,7 @@
     </w:p>
     <w:p>
       <w:pPr>
-        <w:spacing w:before="0" w:after="240"/>
+        <w:spacing w:before="0" w:after="200"/>
         <w:jc w:val="left"/>
       </w:pPr>
       <w:r>
@@ -975,7 +965,7 @@
           <w:b w:val="0"/>
           <w:sz w:val="20"/>
         </w:rPr>
-        <w:t>本次调研整体参考率100%，优良率较高，学生对词语书写等基础积累类题目掌握较好。非连续性文本的基本信息提取能力有所提升，多数学生能找到关键信息作答。习作内容真实，情感较为自然，部分学生叙事完整，有一定文字表达能力。</w:t>
+        <w:t>本次调研参考率100%，整体优良率较高。学生基础积累类题目（词语书写、古诗填写）掌握较好，非连续性文本基本信息提取能力有所提升。习作内容较为真实，情感较自然，部分学生叙事完整流畅，文字表达能力有明显进步。</w:t>
       </w:r>
     </w:p>
     <w:p>
@@ -994,7 +984,7 @@
     </w:p>
     <w:p>
       <w:pPr>
-        <w:spacing w:before="0" w:after="240"/>
+        <w:spacing w:before="0" w:after="200"/>
         <w:jc w:val="left"/>
       </w:pPr>
       <w:r>
@@ -1003,12 +993,12 @@
           <w:b w:val="0"/>
           <w:sz w:val="20"/>
         </w:rPr>
-        <w:t>文言文理解能力、阅读信息提炼归纳能力及习作结构布局能力有待加强。部分学生在选择题中审题不够细致，存在粗心失分现象。C等学生习作字数不达标，叙事能力较弱，需重点跟进辅导。</w:t>
+        <w:t>多音字字音辨析、文言实词义理解及阅读信息的全面提炼能力仍需加强。部分学生选择题审题不细致，存在粗心失分现象。习作结构意识薄弱，叙事层次不清，个别学生字数不达标，需重点跟进。</w:t>
       </w:r>
     </w:p>
     <w:p>
       <w:pPr>
-        <w:spacing w:before="80" w:after="60"/>
+        <w:spacing w:before="80" w:after="80"/>
         <w:jc w:val="left"/>
       </w:pPr>
       <w:r>
@@ -1031,7 +1021,7 @@
           <w:b w:val="0"/>
           <w:sz w:val="20"/>
         </w:rPr>
-        <w:t>①加强词语积累与书写训练，每周设置专项听写，重点关注形近字、难写字的辨析练习，减少错别字失分。</w:t>
+        <w:t>①加强多音字、形近字专项训练，每周设置字音字形听写，结合语境辨析，减少因字音不准导致的失分。</w:t>
       </w:r>
     </w:p>
     <w:p>
@@ -1045,7 +1035,7 @@
           <w:b w:val="0"/>
           <w:sz w:val="20"/>
         </w:rPr>
-        <w:t>②增加文言文阅读训练，引导学生结合语境理解一词多义，逐步提高文言感知与概括归纳能力。</w:t>
+        <w:t>②系统积累文言常见实词，引导学生联系语境理解词义，训练"一词多义"辨析能力，提高文言文整体感知水平。</w:t>
       </w:r>
     </w:p>
     <w:p>
@@ -1059,7 +1049,21 @@
           <w:b w:val="0"/>
           <w:sz w:val="20"/>
         </w:rPr>
-        <w:t>③强化习作结构指导，训练"起—展—情—收"叙事框架，鼓励学生用具体细节支撑情感表达；对C等学生进行个别辅导，帮助其突破字数与叙事完整性两个难关。</w:t>
+        <w:t>③强化阅读信息提炼专项训练，培养学生逐条筛选关键信息的习惯，区分"摘抄原文"与"概括归纳"的答题要求。</w:t>
+      </w:r>
+    </w:p>
+    <w:p>
+      <w:pPr>
+        <w:spacing w:before="0" w:after="80"/>
+        <w:jc w:val="left"/>
+      </w:pPr>
+      <w:r>
+        <w:rPr>
+          <w:rFonts w:ascii="宋体" w:hAnsi="宋体" w:eastAsia="宋体"/>
+          <w:b w:val="0"/>
+          <w:sz w:val="20"/>
+        </w:rPr>
+        <w:t>④加强习作谋篇布局指导，训练"起—展—情—收"叙事框架，鼓励学生以生活细节支撑情感表达；对字数不达标学生进行个别辅导。</w:t>
       </w:r>
     </w:p>
     <w:sectPr>

</xml_diff>